<commit_message>
revise Learning Objectives memo and content matrix
</commit_message>
<xml_diff>
--- a/Accounting Pre-work/CMU METALS Prework Redesign/Learning_Objectives_Memo.docx
+++ b/Accounting Pre-work/CMU METALS Prework Redesign/Learning_Objectives_Memo.docx
@@ -53,12 +53,6 @@
         <w:gridCol w:w="8160"/>
       </w:tblGrid>
       <w:tr>
-        <w:tblPrEx>
-          <w:tblCellMar>
-            <w:top w:w="0" w:type="dxa"/>
-            <w:bottom w:w="0" w:type="dxa"/>
-          </w:tblCellMar>
-        </w:tblPrEx>
         <w:tc>
           <w:tcPr>
             <w:tcW w:w="1200" w:type="dxa"/>
@@ -97,12 +91,6 @@
         </w:tc>
       </w:tr>
       <w:tr>
-        <w:tblPrEx>
-          <w:tblCellMar>
-            <w:top w:w="0" w:type="dxa"/>
-            <w:bottom w:w="0" w:type="dxa"/>
-          </w:tblCellMar>
-        </w:tblPrEx>
         <w:tc>
           <w:tcPr>
             <w:tcW w:w="1200" w:type="dxa"/>
@@ -141,12 +129,6 @@
         </w:tc>
       </w:tr>
       <w:tr>
-        <w:tblPrEx>
-          <w:tblCellMar>
-            <w:top w:w="0" w:type="dxa"/>
-            <w:bottom w:w="0" w:type="dxa"/>
-          </w:tblCellMar>
-        </w:tblPrEx>
         <w:tc>
           <w:tcPr>
             <w:tcW w:w="1200" w:type="dxa"/>
@@ -185,12 +167,6 @@
         </w:tc>
       </w:tr>
       <w:tr>
-        <w:tblPrEx>
-          <w:tblCellMar>
-            <w:top w:w="0" w:type="dxa"/>
-            <w:bottom w:w="0" w:type="dxa"/>
-          </w:tblCellMar>
-        </w:tblPrEx>
         <w:tc>
           <w:tcPr>
             <w:tcW w:w="1200" w:type="dxa"/>
@@ -229,12 +205,6 @@
         </w:tc>
       </w:tr>
       <w:tr>
-        <w:tblPrEx>
-          <w:tblCellMar>
-            <w:top w:w="0" w:type="dxa"/>
-            <w:bottom w:w="0" w:type="dxa"/>
-          </w:tblCellMar>
-        </w:tblPrEx>
         <w:tc>
           <w:tcPr>
             <w:tcW w:w="1200" w:type="dxa"/>
@@ -311,7 +281,13 @@
         <w:t>structural logic of accounting systems</w:t>
       </w:r>
       <w:r>
-        <w:t xml:space="preserve"> before their first course. It does not aim to make students proficient at preparing financial statements, performing ratio analysis, or applying specific GAAP or IFRS rules. It aims to give them the structural understanding that makes the first accounting course intelligible — so that when they encounter debits and credits, journal entries, and specific recognition rules, they understand what the system is, why it evolved this way, and what questions to ask about any number it produces.</w:t>
+        <w:t xml:space="preserve"> before their first course. It does not aim to make students proficient at preparing financial statements, performing ratio analysis, or applying specific GAAP or IFRS rules. It aims to give them the structural understanding that makes the first accounting course intelligible — so that when they encounter </w:t>
+      </w:r>
+      <w:r>
+        <w:t xml:space="preserve">financial statements, </w:t>
+      </w:r>
+      <w:r>
+        <w:t>debits and credits, journal entries, and specific recognition rules, they understand what the system is, why it evolved this way, and what questions to ask about any number it produces.</w:t>
       </w:r>
     </w:p>
     <w:p>
@@ -458,12 +434,6 @@
         <w:gridCol w:w="1800"/>
       </w:tblGrid>
       <w:tr>
-        <w:tblPrEx>
-          <w:tblCellMar>
-            <w:top w:w="0" w:type="dxa"/>
-            <w:bottom w:w="0" w:type="dxa"/>
-          </w:tblCellMar>
-        </w:tblPrEx>
         <w:trPr>
           <w:tblHeader/>
         </w:trPr>
@@ -550,12 +520,6 @@
         </w:tc>
       </w:tr>
       <w:tr>
-        <w:tblPrEx>
-          <w:tblCellMar>
-            <w:top w:w="0" w:type="dxa"/>
-            <w:bottom w:w="0" w:type="dxa"/>
-          </w:tblCellMar>
-        </w:tblPrEx>
         <w:tc>
           <w:tcPr>
             <w:tcW w:w="2400" w:type="dxa"/>
@@ -624,12 +588,6 @@
         </w:tc>
       </w:tr>
       <w:tr>
-        <w:tblPrEx>
-          <w:tblCellMar>
-            <w:top w:w="0" w:type="dxa"/>
-            <w:bottom w:w="0" w:type="dxa"/>
-          </w:tblCellMar>
-        </w:tblPrEx>
         <w:tc>
           <w:tcPr>
             <w:tcW w:w="2400" w:type="dxa"/>
@@ -698,12 +656,6 @@
         </w:tc>
       </w:tr>
       <w:tr>
-        <w:tblPrEx>
-          <w:tblCellMar>
-            <w:top w:w="0" w:type="dxa"/>
-            <w:bottom w:w="0" w:type="dxa"/>
-          </w:tblCellMar>
-        </w:tblPrEx>
         <w:tc>
           <w:tcPr>
             <w:tcW w:w="2400" w:type="dxa"/>
@@ -894,12 +846,6 @@
         <w:gridCol w:w="9360"/>
       </w:tblGrid>
       <w:tr>
-        <w:tblPrEx>
-          <w:tblCellMar>
-            <w:top w:w="0" w:type="dxa"/>
-            <w:bottom w:w="0" w:type="dxa"/>
-          </w:tblCellMar>
-        </w:tblPrEx>
         <w:tc>
           <w:tcPr>
             <w:tcW w:w="9360" w:type="dxa"/>
@@ -1024,12 +970,6 @@
         <w:gridCol w:w="9360"/>
       </w:tblGrid>
       <w:tr>
-        <w:tblPrEx>
-          <w:tblCellMar>
-            <w:top w:w="0" w:type="dxa"/>
-            <w:bottom w:w="0" w:type="dxa"/>
-          </w:tblCellMar>
-        </w:tblPrEx>
         <w:tc>
           <w:tcPr>
             <w:tcW w:w="9360" w:type="dxa"/>
@@ -1165,12 +1105,6 @@
         <w:gridCol w:w="9360"/>
       </w:tblGrid>
       <w:tr>
-        <w:tblPrEx>
-          <w:tblCellMar>
-            <w:top w:w="0" w:type="dxa"/>
-            <w:bottom w:w="0" w:type="dxa"/>
-          </w:tblCellMar>
-        </w:tblPrEx>
         <w:tc>
           <w:tcPr>
             <w:tcW w:w="9360" w:type="dxa"/>
@@ -1295,12 +1229,6 @@
         <w:gridCol w:w="9360"/>
       </w:tblGrid>
       <w:tr>
-        <w:tblPrEx>
-          <w:tblCellMar>
-            <w:top w:w="0" w:type="dxa"/>
-            <w:bottom w:w="0" w:type="dxa"/>
-          </w:tblCellMar>
-        </w:tblPrEx>
         <w:tc>
           <w:tcPr>
             <w:tcW w:w="9360" w:type="dxa"/>
@@ -1439,12 +1367,6 @@
         <w:gridCol w:w="9360"/>
       </w:tblGrid>
       <w:tr>
-        <w:tblPrEx>
-          <w:tblCellMar>
-            <w:top w:w="0" w:type="dxa"/>
-            <w:bottom w:w="0" w:type="dxa"/>
-          </w:tblCellMar>
-        </w:tblPrEx>
         <w:tc>
           <w:tcPr>
             <w:tcW w:w="9360" w:type="dxa"/>
@@ -1569,12 +1491,6 @@
         <w:gridCol w:w="9360"/>
       </w:tblGrid>
       <w:tr>
-        <w:tblPrEx>
-          <w:tblCellMar>
-            <w:top w:w="0" w:type="dxa"/>
-            <w:bottom w:w="0" w:type="dxa"/>
-          </w:tblCellMar>
-        </w:tblPrEx>
         <w:tc>
           <w:tcPr>
             <w:tcW w:w="9360" w:type="dxa"/>
@@ -1713,12 +1629,6 @@
         <w:gridCol w:w="9360"/>
       </w:tblGrid>
       <w:tr>
-        <w:tblPrEx>
-          <w:tblCellMar>
-            <w:top w:w="0" w:type="dxa"/>
-            <w:bottom w:w="0" w:type="dxa"/>
-          </w:tblCellMar>
-        </w:tblPrEx>
         <w:tc>
           <w:tcPr>
             <w:tcW w:w="9360" w:type="dxa"/>
@@ -1867,12 +1777,6 @@
         <w:gridCol w:w="9360"/>
       </w:tblGrid>
       <w:tr>
-        <w:tblPrEx>
-          <w:tblCellMar>
-            <w:top w:w="0" w:type="dxa"/>
-            <w:bottom w:w="0" w:type="dxa"/>
-          </w:tblCellMar>
-        </w:tblPrEx>
         <w:tc>
           <w:tcPr>
             <w:tcW w:w="9360" w:type="dxa"/>
@@ -2014,12 +1918,6 @@
         <w:gridCol w:w="9360"/>
       </w:tblGrid>
       <w:tr>
-        <w:tblPrEx>
-          <w:tblCellMar>
-            <w:top w:w="0" w:type="dxa"/>
-            <w:bottom w:w="0" w:type="dxa"/>
-          </w:tblCellMar>
-        </w:tblPrEx>
         <w:tc>
           <w:tcPr>
             <w:tcW w:w="9360" w:type="dxa"/>
@@ -2158,12 +2056,6 @@
         <w:gridCol w:w="9360"/>
       </w:tblGrid>
       <w:tr>
-        <w:tblPrEx>
-          <w:tblCellMar>
-            <w:top w:w="0" w:type="dxa"/>
-            <w:bottom w:w="0" w:type="dxa"/>
-          </w:tblCellMar>
-        </w:tblPrEx>
         <w:tc>
           <w:tcPr>
             <w:tcW w:w="9360" w:type="dxa"/>
@@ -2312,12 +2204,6 @@
         <w:gridCol w:w="9360"/>
       </w:tblGrid>
       <w:tr>
-        <w:tblPrEx>
-          <w:tblCellMar>
-            <w:top w:w="0" w:type="dxa"/>
-            <w:bottom w:w="0" w:type="dxa"/>
-          </w:tblCellMar>
-        </w:tblPrEx>
         <w:tc>
           <w:tcPr>
             <w:tcW w:w="9360" w:type="dxa"/>
@@ -2425,12 +2311,6 @@
         <w:gridCol w:w="9360"/>
       </w:tblGrid>
       <w:tr>
-        <w:tblPrEx>
-          <w:tblCellMar>
-            <w:top w:w="0" w:type="dxa"/>
-            <w:bottom w:w="0" w:type="dxa"/>
-          </w:tblCellMar>
-        </w:tblPrEx>
         <w:tc>
           <w:tcPr>
             <w:tcW w:w="9360" w:type="dxa"/>
@@ -2568,12 +2448,6 @@
         <w:gridCol w:w="9360"/>
       </w:tblGrid>
       <w:tr>
-        <w:tblPrEx>
-          <w:tblCellMar>
-            <w:top w:w="0" w:type="dxa"/>
-            <w:bottom w:w="0" w:type="dxa"/>
-          </w:tblCellMar>
-        </w:tblPrEx>
         <w:tc>
           <w:tcPr>
             <w:tcW w:w="9360" w:type="dxa"/>
@@ -2648,12 +2522,6 @@
         <w:gridCol w:w="2800"/>
       </w:tblGrid>
       <w:tr>
-        <w:tblPrEx>
-          <w:tblCellMar>
-            <w:top w:w="0" w:type="dxa"/>
-            <w:bottom w:w="0" w:type="dxa"/>
-          </w:tblCellMar>
-        </w:tblPrEx>
         <w:trPr>
           <w:tblHeader/>
         </w:trPr>
@@ -2741,12 +2609,6 @@
         </w:tc>
       </w:tr>
       <w:tr>
-        <w:tblPrEx>
-          <w:tblCellMar>
-            <w:top w:w="0" w:type="dxa"/>
-            <w:bottom w:w="0" w:type="dxa"/>
-          </w:tblCellMar>
-        </w:tblPrEx>
         <w:tc>
           <w:tcPr>
             <w:tcW w:w="1400" w:type="dxa"/>
@@ -2815,12 +2677,6 @@
         </w:tc>
       </w:tr>
       <w:tr>
-        <w:tblPrEx>
-          <w:tblCellMar>
-            <w:top w:w="0" w:type="dxa"/>
-            <w:bottom w:w="0" w:type="dxa"/>
-          </w:tblCellMar>
-        </w:tblPrEx>
         <w:tc>
           <w:tcPr>
             <w:tcW w:w="1400" w:type="dxa"/>
@@ -2889,12 +2745,6 @@
         </w:tc>
       </w:tr>
       <w:tr>
-        <w:tblPrEx>
-          <w:tblCellMar>
-            <w:top w:w="0" w:type="dxa"/>
-            <w:bottom w:w="0" w:type="dxa"/>
-          </w:tblCellMar>
-        </w:tblPrEx>
         <w:tc>
           <w:tcPr>
             <w:tcW w:w="1400" w:type="dxa"/>
@@ -2963,12 +2813,6 @@
         </w:tc>
       </w:tr>
       <w:tr>
-        <w:tblPrEx>
-          <w:tblCellMar>
-            <w:top w:w="0" w:type="dxa"/>
-            <w:bottom w:w="0" w:type="dxa"/>
-          </w:tblCellMar>
-        </w:tblPrEx>
         <w:tc>
           <w:tcPr>
             <w:tcW w:w="1400" w:type="dxa"/>

</xml_diff>